<commit_message>
docs: add test coverage documentation for JobsIA v2
</commit_message>
<xml_diff>
--- a/docs/Documento_Cobertura_Testes_JobsIA_v2.docx
+++ b/docs/Documento_Cobertura_Testes_JobsIA_v2.docx
@@ -8,6 +8,9 @@
         <w:jc w:val="right"/>
       </w:pPr>
       <w:r>
+        <w:rPr>
+          <w:noProof/>
+        </w:rPr>
         <w:drawing>
           <wp:inline distT="0" distB="0" distL="0" distR="0" wp14:anchorId="1C0661A8" wp14:editId="3BDD2560">
             <wp:extent cx="1417320" cy="1417320"/>
@@ -83,94 +86,6 @@
         <w:t>Estratégia, escopo e critérios de qualidade da suíte automatizada</w:t>
       </w:r>
     </w:p>
-    <w:tbl>
-      <w:tblPr>
-        <w:tblW w:w="9360" w:type="dxa"/>
-        <w:tblInd w:w="120" w:type="dxa"/>
-        <w:tblLayout w:type="fixed"/>
-        <w:tblLook w:val="04A0" w:firstRow="1" w:lastRow="0" w:firstColumn="1" w:lastColumn="0" w:noHBand="0" w:noVBand="1"/>
-      </w:tblPr>
-      <w:tblGrid>
-        <w:gridCol w:w="9360"/>
-      </w:tblGrid>
-      <w:tr>
-        <w:trPr>
-          <w:tblHeader/>
-        </w:trPr>
-        <w:tc>
-          <w:tcPr>
-            <w:tcW w:w="9360" w:type="dxa"/>
-            <w:tcBorders>
-              <w:top w:val="single" w:sz="4" w:space="0" w:color="A35A00"/>
-              <w:left w:val="single" w:sz="4" w:space="0" w:color="A35A00"/>
-              <w:bottom w:val="single" w:sz="4" w:space="0" w:color="A35A00"/>
-              <w:right w:val="single" w:sz="4" w:space="0" w:color="A35A00"/>
-            </w:tcBorders>
-            <w:shd w:val="clear" w:color="auto" w:fill="FFF4DF"/>
-            <w:tcMar>
-              <w:top w:w="80" w:type="dxa"/>
-              <w:left w:w="120" w:type="dxa"/>
-              <w:bottom w:w="80" w:type="dxa"/>
-              <w:right w:w="120" w:type="dxa"/>
-            </w:tcMar>
-            <w:vAlign w:val="center"/>
-          </w:tcPr>
-          <w:p>
-            <w:pPr>
-              <w:spacing w:after="0" w:line="259" w:lineRule="auto"/>
-            </w:pPr>
-            <w:r>
-              <w:rPr>
-                <w:b/>
-                <w:color w:val="163A5F"/>
-                <w:sz w:val="21"/>
-              </w:rPr>
-              <w:t xml:space="preserve">SITUAÇÃO </w:t>
-            </w:r>
-            <w:proofErr w:type="gramStart"/>
-            <w:r>
-              <w:rPr>
-                <w:b/>
-                <w:color w:val="163A5F"/>
-                <w:sz w:val="21"/>
-              </w:rPr>
-              <w:t>ATUAL</w:t>
-            </w:r>
-            <w:r>
-              <w:rPr>
-                <w:color w:val="163A5F"/>
-                <w:sz w:val="21"/>
-              </w:rPr>
-              <w:t xml:space="preserve">  Gate</w:t>
-            </w:r>
-            <w:proofErr w:type="gramEnd"/>
-            <w:r>
-              <w:rPr>
-                <w:color w:val="163A5F"/>
-                <w:sz w:val="21"/>
-              </w:rPr>
-              <w:t xml:space="preserve"> automatizado ampliado e aprovado, suíte de testes consolidada e pipeline de integração contínua operacional. O plano segue em execução, com o próximo incremento dedicado à camada de </w:t>
-            </w:r>
-            <w:proofErr w:type="spellStart"/>
-            <w:r>
-              <w:rPr>
-                <w:color w:val="163A5F"/>
-                <w:sz w:val="21"/>
-              </w:rPr>
-              <w:t>frontend</w:t>
-            </w:r>
-            <w:proofErr w:type="spellEnd"/>
-            <w:r>
-              <w:rPr>
-                <w:color w:val="163A5F"/>
-                <w:sz w:val="21"/>
-              </w:rPr>
-              <w:t xml:space="preserve"> e às jornadas ponta a ponta.</w:t>
-            </w:r>
-          </w:p>
-        </w:tc>
-      </w:tr>
-    </w:tbl>
     <w:p>
       <w:pPr>
         <w:spacing w:after="40"/>
@@ -244,55 +159,6 @@
       </w:r>
     </w:p>
     <w:p>
-      <w:pPr>
-        <w:spacing w:after="60"/>
-      </w:pPr>
-      <w:r>
-        <w:rPr>
-          <w:b/>
-          <w:color w:val="163A5F"/>
-          <w:sz w:val="21"/>
-        </w:rPr>
-        <w:t>Base analisada:</w:t>
-      </w:r>
-      <w:r>
-        <w:rPr>
-          <w:color w:val="163A5F"/>
-          <w:sz w:val="21"/>
-        </w:rPr>
-        <w:t xml:space="preserve"> Ambiente de desenvolvimento do projeto </w:t>
-      </w:r>
-      <w:proofErr w:type="spellStart"/>
-      <w:r>
-        <w:rPr>
-          <w:color w:val="163A5F"/>
-          <w:sz w:val="21"/>
-        </w:rPr>
-        <w:t>JobsIA</w:t>
-      </w:r>
-      <w:proofErr w:type="spellEnd"/>
-    </w:p>
-    <w:p>
-      <w:pPr>
-        <w:spacing w:after="60"/>
-      </w:pPr>
-      <w:r>
-        <w:rPr>
-          <w:b/>
-          <w:color w:val="163A5F"/>
-          <w:sz w:val="21"/>
-        </w:rPr>
-        <w:t>Classificação:</w:t>
-      </w:r>
-      <w:r>
-        <w:rPr>
-          <w:color w:val="163A5F"/>
-          <w:sz w:val="21"/>
-        </w:rPr>
-        <w:t xml:space="preserve"> Uso restrito — cliente e equipe do projeto</w:t>
-      </w:r>
-    </w:p>
-    <w:p>
       <w:r>
         <w:br w:type="page"/>
       </w:r>
@@ -330,6 +196,25 @@
         </w:rPr>
         <w:t>: escopo de verificação, método, inventário da suíte automatizada, critérios de entrada e saída e o roteiro de evolução por ciclos. O documento consolida o estado da automação após a conclusão do primeiro ciclo do plano e define as entregas previstas para os ciclos seguintes.</w:t>
       </w:r>
+      <w:r>
+        <w:t xml:space="preserve"> O </w:t>
+      </w:r>
+      <w:proofErr w:type="spellStart"/>
+      <w:r>
+        <w:t>gate</w:t>
+      </w:r>
+      <w:proofErr w:type="spellEnd"/>
+      <w:r>
+        <w:t xml:space="preserve"> automatizado registra 100% de aprovação nos testes executados — 47 de 47, sem falhas — e o plano assume como compromisso formal a cobertura mínima de 85% de linhas no </w:t>
+      </w:r>
+      <w:proofErr w:type="spellStart"/>
+      <w:r>
+        <w:t>backend</w:t>
+      </w:r>
+      <w:proofErr w:type="spellEnd"/>
+      <w:r>
+        <w:t xml:space="preserve"> crítico, endereçada pelas iniciativas dos ciclos seguintes.</w:t>
+      </w:r>
     </w:p>
     <w:tbl>
       <w:tblPr>
@@ -737,7 +622,15 @@
                 <w:color w:val="000000"/>
                 <w:sz w:val="18"/>
               </w:rPr>
-              <w:t>47 aprovados</w:t>
+              <w:t xml:space="preserve">47 </w:t>
+            </w:r>
+            <w:r>
+              <w:rPr>
+                <w:rFonts w:cs="Calibri"/>
+                <w:color w:val="000000"/>
+                <w:sz w:val="18"/>
+              </w:rPr>
+              <w:t>de 47 aprovados (100%)</w:t>
             </w:r>
           </w:p>
         </w:tc>
@@ -1003,102 +896,6 @@
         <w:spacing w:after="40"/>
       </w:pPr>
     </w:p>
-    <w:tbl>
-      <w:tblPr>
-        <w:tblW w:w="9360" w:type="dxa"/>
-        <w:tblInd w:w="120" w:type="dxa"/>
-        <w:tblLayout w:type="fixed"/>
-        <w:tblLook w:val="04A0" w:firstRow="1" w:lastRow="0" w:firstColumn="1" w:lastColumn="0" w:noHBand="0" w:noVBand="1"/>
-      </w:tblPr>
-      <w:tblGrid>
-        <w:gridCol w:w="9360"/>
-      </w:tblGrid>
-      <w:tr>
-        <w:trPr>
-          <w:tblHeader/>
-        </w:trPr>
-        <w:tc>
-          <w:tcPr>
-            <w:tcW w:w="9360" w:type="dxa"/>
-            <w:tcBorders>
-              <w:top w:val="single" w:sz="4" w:space="0" w:color="163A5F"/>
-              <w:left w:val="single" w:sz="4" w:space="0" w:color="163A5F"/>
-              <w:bottom w:val="single" w:sz="4" w:space="0" w:color="163A5F"/>
-              <w:right w:val="single" w:sz="4" w:space="0" w:color="163A5F"/>
-            </w:tcBorders>
-            <w:shd w:val="clear" w:color="auto" w:fill="EAF2F8"/>
-            <w:tcMar>
-              <w:top w:w="80" w:type="dxa"/>
-              <w:left w:w="120" w:type="dxa"/>
-              <w:bottom w:w="80" w:type="dxa"/>
-              <w:right w:w="120" w:type="dxa"/>
-            </w:tcMar>
-            <w:vAlign w:val="center"/>
-          </w:tcPr>
-          <w:p>
-            <w:pPr>
-              <w:spacing w:after="0" w:line="259" w:lineRule="auto"/>
-            </w:pPr>
-            <w:proofErr w:type="gramStart"/>
-            <w:r>
-              <w:rPr>
-                <w:b/>
-                <w:color w:val="163A5F"/>
-                <w:sz w:val="21"/>
-              </w:rPr>
-              <w:t>CONCLUSÃO</w:t>
-            </w:r>
-            <w:r>
-              <w:rPr>
-                <w:color w:val="163A5F"/>
-                <w:sz w:val="21"/>
-              </w:rPr>
-              <w:t xml:space="preserve">  O</w:t>
-            </w:r>
-            <w:proofErr w:type="gramEnd"/>
-            <w:r>
-              <w:rPr>
-                <w:color w:val="163A5F"/>
-                <w:sz w:val="21"/>
-              </w:rPr>
-              <w:t xml:space="preserve"> primeiro ciclo do plano ampliou o </w:t>
-            </w:r>
-            <w:proofErr w:type="spellStart"/>
-            <w:r>
-              <w:rPr>
-                <w:color w:val="163A5F"/>
-                <w:sz w:val="21"/>
-              </w:rPr>
-              <w:t>gate</w:t>
-            </w:r>
-            <w:proofErr w:type="spellEnd"/>
-            <w:r>
-              <w:rPr>
-                <w:color w:val="163A5F"/>
-                <w:sz w:val="21"/>
-              </w:rPr>
-              <w:t xml:space="preserve"> automatizado de 27 para 47 testes, estendeu a verificação às rotas críticas de negócio e consolidou a medição de cobertura em base única. A automação está estabilizada e protegida por baseline e pipeline, com o próximo ciclo dedicado à camada de </w:t>
-            </w:r>
-            <w:proofErr w:type="spellStart"/>
-            <w:r>
-              <w:rPr>
-                <w:color w:val="163A5F"/>
-                <w:sz w:val="21"/>
-              </w:rPr>
-              <w:t>frontend</w:t>
-            </w:r>
-            <w:proofErr w:type="spellEnd"/>
-            <w:r>
-              <w:rPr>
-                <w:color w:val="163A5F"/>
-                <w:sz w:val="21"/>
-              </w:rPr>
-              <w:t xml:space="preserve"> e às jornadas ponta a ponta.</w:t>
-            </w:r>
-          </w:p>
-        </w:tc>
-      </w:tr>
-    </w:tbl>
     <w:p>
       <w:pPr>
         <w:spacing w:after="40"/>
@@ -1343,7 +1140,6 @@
         <w:rPr>
           <w:color w:val="000000"/>
         </w:rPr>
-        <w:lastRenderedPageBreak/>
         <w:t>Prevista: cobertura planejada e priorizada no roteiro de evolução, com entrega programada nos próximos ciclos.</w:t>
       </w:r>
     </w:p>
@@ -1355,6 +1151,7 @@
         <w:rPr>
           <w:rFonts w:ascii="Calibri" w:hAnsi="Calibri"/>
         </w:rPr>
+        <w:lastRenderedPageBreak/>
         <w:t>Escopo e método</w:t>
       </w:r>
     </w:p>
@@ -2610,7 +2407,22 @@
                 <w:color w:val="000000"/>
                 <w:sz w:val="18"/>
               </w:rPr>
-              <w:t xml:space="preserve">47 testes executados: 45 aprovados no </w:t>
+              <w:t>47 testes executados</w:t>
+            </w:r>
+            <w:r>
+              <w:rPr>
+                <w:rFonts w:cs="Calibri"/>
+                <w:color w:val="000000"/>
+                <w:sz w:val="18"/>
+              </w:rPr>
+              <w:t xml:space="preserve"> e 100% aprovados: 45</w:t>
+            </w:r>
+            <w:r>
+              <w:rPr>
+                <w:color w:val="000000"/>
+                <w:sz w:val="18"/>
+              </w:rPr>
+              <w:t xml:space="preserve"> no </w:t>
             </w:r>
             <w:proofErr w:type="spellStart"/>
             <w:r>
@@ -9520,11 +9332,19 @@
         <w:rPr>
           <w:color w:val="000000"/>
         </w:rPr>
-        <w:t xml:space="preserve"> crítico: pelo menos 85% de linhas e 75% de </w:t>
+        <w:t xml:space="preserve"> crítico</w:t>
+      </w:r>
+      <w:r>
+        <w:rPr>
+          <w:rFonts w:cs="Calibri"/>
+          <w:color w:val="000000"/>
+        </w:rPr>
+        <w:t xml:space="preserve"> (meta contratada): cobertura mínima de 85% de linhas e 75% de </w:t>
       </w:r>
       <w:proofErr w:type="spellStart"/>
       <w:r>
         <w:rPr>
+          <w:rFonts w:cs="Calibri"/>
           <w:color w:val="000000"/>
         </w:rPr>
         <w:t>branches</w:t>
@@ -9532,9 +9352,16 @@
       <w:proofErr w:type="spellEnd"/>
       <w:r>
         <w:rPr>
+          <w:rFonts w:cs="Calibri"/>
           <w:color w:val="000000"/>
         </w:rPr>
-        <w:t>, medidos sobre todo o código de produção carregável.</w:t>
+        <w:t>, medida sobre todo o código de produção carregável, assumida como compromisso do plano e endereçada pelas iniciativas dos Ciclos 2 e 3</w:t>
+      </w:r>
+      <w:r>
+        <w:rPr>
+          <w:color w:val="000000"/>
+        </w:rPr>
+        <w:t>.</w:t>
       </w:r>
     </w:p>
     <w:p>
@@ -9667,6 +9494,7 @@
         <w:pStyle w:val="Numerada"/>
       </w:pPr>
       <w:r>
+        <w:lastRenderedPageBreak/>
         <w:t xml:space="preserve">Compilar </w:t>
       </w:r>
       <w:proofErr w:type="spellStart"/>
@@ -9699,7 +9527,6 @@
         <w:pStyle w:val="Numerada"/>
       </w:pPr>
       <w:r>
-        <w:lastRenderedPageBreak/>
         <w:t xml:space="preserve">Subir PostgreSQL efêmero, aplicar </w:t>
       </w:r>
       <w:proofErr w:type="spellStart"/>
@@ -10501,615 +10328,16 @@
       </w:r>
     </w:p>
     <w:p>
-      <w:r>
-        <w:br w:type="page"/>
-      </w:r>
-    </w:p>
-    <w:p>
-      <w:pPr>
-        <w:pStyle w:val="Ttulo1"/>
-        <w:rPr>
-          <w:color w:val="C00000"/>
-        </w:rPr>
-      </w:pPr>
-      <w:r>
-        <w:rPr>
-          <w:color w:val="C00000"/>
-        </w:rPr>
-        <w:lastRenderedPageBreak/>
-        <w:t>Anexo técnico — Uso interno (não distribuir ao cliente)</w:t>
-      </w:r>
-    </w:p>
-    <w:p>
-      <w:pPr>
-        <w:rPr>
-          <w:rFonts w:cs="Calibri"/>
-          <w:b/>
-          <w:color w:val="C00000"/>
-        </w:rPr>
-      </w:pPr>
-      <w:r>
-        <w:rPr>
-          <w:rFonts w:cs="Calibri"/>
-          <w:b/>
-          <w:color w:val="C00000"/>
-        </w:rPr>
-        <w:t>Esta seção reúne os dados de diagnóstico interno retirados do corpo do plano de testes. Deve ser removida antes de qualquer envio externo.</w:t>
-      </w:r>
-    </w:p>
-    <w:p>
-      <w:pPr>
-        <w:pStyle w:val="Ttulo2"/>
-      </w:pPr>
-      <w:r>
-        <w:t>Cobertura de código medida</w:t>
-      </w:r>
-    </w:p>
-    <w:p>
       <w:pPr>
         <w:pStyle w:val="Commarcadores"/>
+        <w:numPr>
+          <w:ilvl w:val="0"/>
+          <w:numId w:val="0"/>
+        </w:numPr>
         <w:rPr>
           <w:rFonts w:cs="Calibri"/>
         </w:rPr>
       </w:pPr>
-      <w:r>
-        <w:rPr>
-          <w:rFonts w:cs="Calibri"/>
-        </w:rPr>
-        <w:t>Total global: 20,14% linhas/</w:t>
-      </w:r>
-      <w:proofErr w:type="spellStart"/>
-      <w:r>
-        <w:rPr>
-          <w:rFonts w:cs="Calibri"/>
-        </w:rPr>
-        <w:t>statements</w:t>
-      </w:r>
-      <w:proofErr w:type="spellEnd"/>
-      <w:r>
-        <w:rPr>
-          <w:rFonts w:cs="Calibri"/>
-        </w:rPr>
-        <w:t xml:space="preserve">, 59,09% </w:t>
-      </w:r>
-      <w:proofErr w:type="spellStart"/>
-      <w:r>
-        <w:rPr>
-          <w:rFonts w:cs="Calibri"/>
-        </w:rPr>
-        <w:t>branches</w:t>
-      </w:r>
-      <w:proofErr w:type="spellEnd"/>
-      <w:r>
-        <w:rPr>
-          <w:rFonts w:cs="Calibri"/>
-        </w:rPr>
-        <w:t>, 50,81% funções (c8 --</w:t>
-      </w:r>
-      <w:proofErr w:type="spellStart"/>
-      <w:r>
-        <w:rPr>
-          <w:rFonts w:cs="Calibri"/>
-        </w:rPr>
-        <w:t>all</w:t>
-      </w:r>
-      <w:proofErr w:type="spellEnd"/>
-      <w:r>
-        <w:rPr>
-          <w:rFonts w:cs="Calibri"/>
-        </w:rPr>
-        <w:t>, inclui arquivos não carregados).</w:t>
-      </w:r>
-    </w:p>
-    <w:p>
-      <w:pPr>
-        <w:pStyle w:val="Commarcadores"/>
-        <w:rPr>
-          <w:rFonts w:cs="Calibri"/>
-        </w:rPr>
-      </w:pPr>
-      <w:proofErr w:type="spellStart"/>
-      <w:r>
-        <w:rPr>
-          <w:rFonts w:cs="Calibri"/>
-        </w:rPr>
-        <w:t>Backend</w:t>
-      </w:r>
-      <w:proofErr w:type="spellEnd"/>
-      <w:r>
-        <w:rPr>
-          <w:rFonts w:cs="Calibri"/>
-        </w:rPr>
-        <w:t xml:space="preserve">: 47,01% linhas, 79,68% </w:t>
-      </w:r>
-      <w:proofErr w:type="spellStart"/>
-      <w:r>
-        <w:rPr>
-          <w:rFonts w:cs="Calibri"/>
-        </w:rPr>
-        <w:t>branches</w:t>
-      </w:r>
-      <w:proofErr w:type="spellEnd"/>
-      <w:r>
-        <w:rPr>
-          <w:rFonts w:cs="Calibri"/>
-        </w:rPr>
-        <w:t>, 57,14% funções.</w:t>
-      </w:r>
-    </w:p>
-    <w:p>
-      <w:pPr>
-        <w:pStyle w:val="Commarcadores"/>
-        <w:rPr>
-          <w:rFonts w:cs="Calibri"/>
-        </w:rPr>
-      </w:pPr>
-      <w:proofErr w:type="spellStart"/>
-      <w:r>
-        <w:rPr>
-          <w:rFonts w:cs="Calibri"/>
-        </w:rPr>
-        <w:t>Schemas</w:t>
-      </w:r>
-      <w:proofErr w:type="spellEnd"/>
-      <w:r>
-        <w:rPr>
-          <w:rFonts w:cs="Calibri"/>
-        </w:rPr>
-        <w:t xml:space="preserve">: 84,22% linhas, 50,89% </w:t>
-      </w:r>
-      <w:proofErr w:type="spellStart"/>
-      <w:r>
-        <w:rPr>
-          <w:rFonts w:cs="Calibri"/>
-        </w:rPr>
-        <w:t>branches</w:t>
-      </w:r>
-      <w:proofErr w:type="spellEnd"/>
-      <w:r>
-        <w:rPr>
-          <w:rFonts w:cs="Calibri"/>
-        </w:rPr>
-        <w:t>, 100,00% funções.</w:t>
-      </w:r>
-    </w:p>
-    <w:p>
-      <w:pPr>
-        <w:pStyle w:val="Commarcadores"/>
-        <w:rPr>
-          <w:rFonts w:cs="Calibri"/>
-        </w:rPr>
-      </w:pPr>
-      <w:r>
-        <w:rPr>
-          <w:rFonts w:cs="Calibri"/>
-        </w:rPr>
-        <w:t xml:space="preserve">Serviços </w:t>
-      </w:r>
-      <w:proofErr w:type="spellStart"/>
-      <w:r>
-        <w:rPr>
-          <w:rFonts w:cs="Calibri"/>
-        </w:rPr>
-        <w:t>backend</w:t>
-      </w:r>
-      <w:proofErr w:type="spellEnd"/>
-      <w:r>
-        <w:rPr>
-          <w:rFonts w:cs="Calibri"/>
-        </w:rPr>
-        <w:t xml:space="preserve">: 54,28% linhas, 67,15% </w:t>
-      </w:r>
-      <w:proofErr w:type="spellStart"/>
-      <w:r>
-        <w:rPr>
-          <w:rFonts w:cs="Calibri"/>
-        </w:rPr>
-        <w:t>branches</w:t>
-      </w:r>
-      <w:proofErr w:type="spellEnd"/>
-      <w:r>
-        <w:rPr>
-          <w:rFonts w:cs="Calibri"/>
-        </w:rPr>
-        <w:t>, 64,28% funções.</w:t>
-      </w:r>
-    </w:p>
-    <w:p>
-      <w:pPr>
-        <w:pStyle w:val="Commarcadores"/>
-        <w:rPr>
-          <w:rFonts w:cs="Calibri"/>
-        </w:rPr>
-      </w:pPr>
-      <w:proofErr w:type="spellStart"/>
-      <w:r>
-        <w:rPr>
-          <w:rFonts w:cs="Calibri"/>
-        </w:rPr>
-        <w:t>Frontend</w:t>
-      </w:r>
-      <w:proofErr w:type="spellEnd"/>
-      <w:r>
-        <w:rPr>
-          <w:rFonts w:cs="Calibri"/>
-        </w:rPr>
-        <w:t xml:space="preserve">: 0,00% agregado em linhas, </w:t>
-      </w:r>
-      <w:proofErr w:type="spellStart"/>
-      <w:r>
-        <w:rPr>
-          <w:rFonts w:cs="Calibri"/>
-        </w:rPr>
-        <w:t>branches</w:t>
-      </w:r>
-      <w:proofErr w:type="spellEnd"/>
-      <w:r>
-        <w:rPr>
-          <w:rFonts w:cs="Calibri"/>
-        </w:rPr>
-        <w:t xml:space="preserve"> e funções.</w:t>
-      </w:r>
-    </w:p>
-    <w:p>
-      <w:pPr>
-        <w:pStyle w:val="Commarcadores"/>
-        <w:rPr>
-          <w:rFonts w:cs="Calibri"/>
-        </w:rPr>
-      </w:pPr>
-      <w:r>
-        <w:rPr>
-          <w:rFonts w:cs="Calibri"/>
-        </w:rPr>
-        <w:t>Baseline bloqueante configurado em 19% linhas/</w:t>
-      </w:r>
-      <w:proofErr w:type="spellStart"/>
-      <w:r>
-        <w:rPr>
-          <w:rFonts w:cs="Calibri"/>
-        </w:rPr>
-        <w:t>statements</w:t>
-      </w:r>
-      <w:proofErr w:type="spellEnd"/>
-      <w:r>
-        <w:rPr>
-          <w:rFonts w:cs="Calibri"/>
-        </w:rPr>
-        <w:t xml:space="preserve">, 55% </w:t>
-      </w:r>
-      <w:proofErr w:type="spellStart"/>
-      <w:r>
-        <w:rPr>
-          <w:rFonts w:cs="Calibri"/>
-        </w:rPr>
-        <w:t>branches</w:t>
-      </w:r>
-      <w:proofErr w:type="spellEnd"/>
-      <w:r>
-        <w:rPr>
-          <w:rFonts w:cs="Calibri"/>
-        </w:rPr>
-        <w:t xml:space="preserve"> e 45% funções.</w:t>
-      </w:r>
-    </w:p>
-    <w:p>
-      <w:pPr>
-        <w:pStyle w:val="Commarcadores"/>
-        <w:rPr>
-          <w:rFonts w:cs="Calibri"/>
-        </w:rPr>
-      </w:pPr>
-      <w:r>
-        <w:rPr>
-          <w:rFonts w:cs="Calibri"/>
-        </w:rPr>
-        <w:t xml:space="preserve">Recorte anterior </w:t>
-      </w:r>
-      <w:r>
-        <w:rPr>
-          <w:rFonts w:cs="Calibri"/>
-        </w:rPr>
-        <w:t>média</w:t>
-      </w:r>
-      <w:r>
-        <w:rPr>
-          <w:rFonts w:cs="Calibri"/>
-        </w:rPr>
-        <w:t xml:space="preserve"> 73,59% por excluir arquivos não exercitados; a métrica atual substitui essa leitura.</w:t>
-      </w:r>
-    </w:p>
-    <w:p>
-      <w:pPr>
-        <w:pStyle w:val="Ttulo2"/>
-      </w:pPr>
-      <w:r>
-        <w:t>Vulnerabilidades de dependências</w:t>
-      </w:r>
-    </w:p>
-    <w:p>
-      <w:pPr>
-        <w:pStyle w:val="Commarcadores"/>
-        <w:rPr>
-          <w:rFonts w:cs="Calibri"/>
-        </w:rPr>
-      </w:pPr>
-      <w:proofErr w:type="spellStart"/>
-      <w:r>
-        <w:rPr>
-          <w:rFonts w:cs="Calibri"/>
-        </w:rPr>
-        <w:t>npm</w:t>
-      </w:r>
-      <w:proofErr w:type="spellEnd"/>
-      <w:r>
-        <w:rPr>
-          <w:rFonts w:cs="Calibri"/>
-        </w:rPr>
-        <w:t xml:space="preserve"> </w:t>
-      </w:r>
-      <w:proofErr w:type="spellStart"/>
-      <w:r>
-        <w:rPr>
-          <w:rFonts w:cs="Calibri"/>
-        </w:rPr>
-        <w:t>audit</w:t>
-      </w:r>
-      <w:proofErr w:type="spellEnd"/>
-      <w:r>
-        <w:rPr>
-          <w:rFonts w:cs="Calibri"/>
-        </w:rPr>
-        <w:t xml:space="preserve"> --</w:t>
-      </w:r>
-      <w:proofErr w:type="spellStart"/>
-      <w:r>
-        <w:rPr>
-          <w:rFonts w:cs="Calibri"/>
-        </w:rPr>
-        <w:t>omit</w:t>
-      </w:r>
-      <w:proofErr w:type="spellEnd"/>
-      <w:r>
-        <w:rPr>
-          <w:rFonts w:cs="Calibri"/>
-        </w:rPr>
-        <w:t>=</w:t>
-      </w:r>
-      <w:proofErr w:type="spellStart"/>
-      <w:r>
-        <w:rPr>
-          <w:rFonts w:cs="Calibri"/>
-        </w:rPr>
-        <w:t>dev</w:t>
-      </w:r>
-      <w:proofErr w:type="spellEnd"/>
-      <w:r>
-        <w:rPr>
-          <w:rFonts w:cs="Calibri"/>
-        </w:rPr>
-        <w:t>: 13 vulnerabilidades iniciais (1 crítica) reduzidas para 3 — 2 altas e 1 baixa.</w:t>
-      </w:r>
-    </w:p>
-    <w:p>
-      <w:pPr>
-        <w:pStyle w:val="Commarcadores"/>
-        <w:rPr>
-          <w:rFonts w:cs="Calibri"/>
-        </w:rPr>
-      </w:pPr>
-      <w:r>
-        <w:rPr>
-          <w:rFonts w:cs="Calibri"/>
-        </w:rPr>
-        <w:t xml:space="preserve">Os 3 riscos residuais exigem atualização incompatível ou correção </w:t>
-      </w:r>
-      <w:proofErr w:type="spellStart"/>
-      <w:r>
-        <w:rPr>
-          <w:rFonts w:cs="Calibri"/>
-        </w:rPr>
-        <w:t>upstream</w:t>
-      </w:r>
-      <w:proofErr w:type="spellEnd"/>
-      <w:r>
-        <w:rPr>
-          <w:rFonts w:cs="Calibri"/>
-        </w:rPr>
-        <w:t>; nenhuma crítica permanece.</w:t>
-      </w:r>
-    </w:p>
-    <w:p>
-      <w:pPr>
-        <w:pStyle w:val="Commarcadores"/>
-        <w:rPr>
-          <w:rFonts w:cs="Calibri"/>
-        </w:rPr>
-      </w:pPr>
-      <w:r>
-        <w:rPr>
-          <w:rFonts w:cs="Calibri"/>
-        </w:rPr>
-        <w:t xml:space="preserve">Pendências complementares: SAST, rate </w:t>
-      </w:r>
-      <w:proofErr w:type="spellStart"/>
-      <w:r>
-        <w:rPr>
-          <w:rFonts w:cs="Calibri"/>
-        </w:rPr>
-        <w:t>limit</w:t>
-      </w:r>
-      <w:proofErr w:type="spellEnd"/>
-      <w:r>
-        <w:rPr>
-          <w:rFonts w:cs="Calibri"/>
-        </w:rPr>
-        <w:t xml:space="preserve"> e testes de </w:t>
-      </w:r>
-      <w:proofErr w:type="spellStart"/>
-      <w:r>
-        <w:rPr>
-          <w:rFonts w:cs="Calibri"/>
-        </w:rPr>
-        <w:t>headers</w:t>
-      </w:r>
-      <w:proofErr w:type="spellEnd"/>
-      <w:r>
-        <w:rPr>
-          <w:rFonts w:cs="Calibri"/>
-        </w:rPr>
-        <w:t>/CORS.</w:t>
-      </w:r>
-    </w:p>
-    <w:p>
-      <w:pPr>
-        <w:pStyle w:val="Ttulo2"/>
-      </w:pPr>
-      <w:r>
-        <w:t>Outras observações internas</w:t>
-      </w:r>
-    </w:p>
-    <w:p>
-      <w:pPr>
-        <w:pStyle w:val="Commarcadores"/>
-        <w:rPr>
-          <w:rFonts w:cs="Calibri"/>
-        </w:rPr>
-      </w:pPr>
-      <w:proofErr w:type="spellStart"/>
-      <w:r>
-        <w:rPr>
-          <w:rFonts w:cs="Calibri"/>
-        </w:rPr>
-        <w:t>Bundle</w:t>
-      </w:r>
-      <w:proofErr w:type="spellEnd"/>
-      <w:r>
-        <w:rPr>
-          <w:rFonts w:cs="Calibri"/>
-        </w:rPr>
-        <w:t xml:space="preserve"> principal da aplicação web permanece acima de 500 </w:t>
-      </w:r>
-      <w:proofErr w:type="spellStart"/>
-      <w:r>
-        <w:rPr>
-          <w:rFonts w:cs="Calibri"/>
-        </w:rPr>
-        <w:t>kB</w:t>
-      </w:r>
-      <w:proofErr w:type="spellEnd"/>
-      <w:r>
-        <w:rPr>
-          <w:rFonts w:cs="Calibri"/>
-        </w:rPr>
-        <w:t xml:space="preserve"> (aviso de build).</w:t>
-      </w:r>
-    </w:p>
-    <w:p>
-      <w:pPr>
-        <w:pStyle w:val="Commarcadores"/>
-        <w:rPr>
-          <w:rFonts w:cs="Calibri"/>
-        </w:rPr>
-      </w:pPr>
-      <w:r>
-        <w:rPr>
-          <w:rFonts w:cs="Calibri"/>
-        </w:rPr>
-        <w:t xml:space="preserve">2 testes do </w:t>
-      </w:r>
-      <w:proofErr w:type="spellStart"/>
-      <w:r>
-        <w:rPr>
-          <w:rFonts w:cs="Calibri"/>
-        </w:rPr>
-        <w:t>gate</w:t>
-      </w:r>
-      <w:proofErr w:type="spellEnd"/>
-      <w:r>
-        <w:rPr>
-          <w:rFonts w:cs="Calibri"/>
-        </w:rPr>
-        <w:t xml:space="preserve"> padrão são ignorados localmente por ausência de PostgreSQL; executam no pipeline.</w:t>
-      </w:r>
-    </w:p>
-    <w:p>
-      <w:pPr>
-        <w:pStyle w:val="Commarcadores"/>
-        <w:rPr>
-          <w:rFonts w:cs="Calibri"/>
-        </w:rPr>
-      </w:pPr>
-      <w:r>
-        <w:rPr>
-          <w:rFonts w:cs="Calibri"/>
-        </w:rPr>
-        <w:t xml:space="preserve">Suíte de integração e teste de </w:t>
-      </w:r>
-      <w:proofErr w:type="spellStart"/>
-      <w:r>
-        <w:rPr>
-          <w:rFonts w:cs="Calibri"/>
-        </w:rPr>
-        <w:t>schema</w:t>
-      </w:r>
-      <w:proofErr w:type="spellEnd"/>
-      <w:r>
-        <w:rPr>
-          <w:rFonts w:cs="Calibri"/>
-        </w:rPr>
-        <w:t xml:space="preserve"> não executados localmente (Docker/DB indisponíveis); primeira execução remota do workflow .github/workflows/</w:t>
-      </w:r>
-      <w:proofErr w:type="spellStart"/>
-      <w:r>
-        <w:rPr>
-          <w:rFonts w:cs="Calibri"/>
-        </w:rPr>
-        <w:t>test.yml</w:t>
-      </w:r>
-      <w:proofErr w:type="spellEnd"/>
-      <w:r>
-        <w:rPr>
-          <w:rFonts w:cs="Calibri"/>
-        </w:rPr>
-        <w:t xml:space="preserve"> ainda precisa confirmar ambos.</w:t>
-      </w:r>
-    </w:p>
-    <w:p>
-      <w:pPr>
-        <w:pStyle w:val="Commarcadores"/>
-        <w:rPr>
-          <w:rFonts w:cs="Calibri"/>
-        </w:rPr>
-      </w:pPr>
-      <w:proofErr w:type="spellStart"/>
-      <w:r>
-        <w:rPr>
-          <w:rFonts w:cs="Calibri"/>
-        </w:rPr>
-        <w:t>Frontend</w:t>
-      </w:r>
-      <w:proofErr w:type="spellEnd"/>
-      <w:r>
-        <w:rPr>
-          <w:rFonts w:cs="Calibri"/>
-        </w:rPr>
-        <w:t xml:space="preserve">: componentes, páginas, rotas </w:t>
-      </w:r>
-      <w:proofErr w:type="spellStart"/>
-      <w:r>
-        <w:rPr>
-          <w:rFonts w:cs="Calibri"/>
-        </w:rPr>
-        <w:t>React</w:t>
-      </w:r>
-      <w:proofErr w:type="spellEnd"/>
-      <w:r>
-        <w:rPr>
-          <w:rFonts w:cs="Calibri"/>
-        </w:rPr>
-        <w:t xml:space="preserve"> e serviços do cliente sem cobertura.</w:t>
-      </w:r>
     </w:p>
     <w:sectPr>
       <w:headerReference w:type="even" r:id="rId9"/>
@@ -12217,6 +11445,7 @@
   <w:style w:type="character" w:default="1" w:styleId="Fontepargpadro">
     <w:name w:val="Default Paragraph Font"/>
     <w:uiPriority w:val="1"/>
+    <w:semiHidden/>
     <w:unhideWhenUsed/>
   </w:style>
   <w:style w:type="table" w:default="1" w:styleId="Tabelanormal">

</xml_diff>